<commit_message>
backup: tự động 21/09/2026 21:00 (2 tệp)
</commit_message>
<xml_diff>
--- a/30-Ket-Qua/2026-09-21/Bao-cao-thang-9/BC_Bao-cao-ket-qua-thang-9-va-KH-thang-10-2026_DU-THAO_20260921.docx
+++ b/30-Ket-Qua/2026-09-21/Bao-cao-thang-9/BC_Bao-cao-ket-qua-thang-9-va-KH-thang-10-2026_DU-THAO_20260921.docx
@@ -114,7 +114,7 @@
                     </wp:anchor>
                   </w:drawing>
                 </mc:Choice>
-                <mc:Fallback xmlns:w16cei="http://schemas.microsoft.com/office/word/2026/wordml/cei" xmlns:w16sdtfl="http://schemas.microsoft.com/office/word/2024/wordml/sdtformatlock" xmlns:wpsCustomData="http://www.wps.cn/officeDocument/2013/wpsCustomData">
+                <mc:Fallback xmlns:wpsCustomData="http://www.wps.cn/officeDocument/2013/wpsCustomData" xmlns:w16sdtfl="http://schemas.microsoft.com/office/word/2024/wordml/sdtformatlock" xmlns:w16cei="http://schemas.microsoft.com/office/word/2026/wordml/cei">
                   <w:pict>
                     <v:line id="Line 68" o:spid="_x0000_s1026" o:spt="20" style="position:absolute;left:0pt;margin-left:68.6pt;margin-top:0.95pt;height:0pt;width:68.25pt;z-index:251660288;mso-width-relative:page;mso-height-relative:page;" filled="f" stroked="t" coordsize="21600,21600" o:gfxdata="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">
                       <v:fill on="f" focussize="0,0"/>
@@ -213,7 +213,7 @@
                     </wp:anchor>
                   </w:drawing>
                 </mc:Choice>
-                <mc:Fallback xmlns:w16cei="http://schemas.microsoft.com/office/word/2026/wordml/cei" xmlns:w16sdtfl="http://schemas.microsoft.com/office/word/2024/wordml/sdtformatlock">
+                <mc:Fallback xmlns:w16sdtfl="http://schemas.microsoft.com/office/word/2024/wordml/sdtformatlock" xmlns:w16cei="http://schemas.microsoft.com/office/word/2026/wordml/cei">
                   <w:pict>
                     <v:line w14:anchorId="74D22E4D" id="Line 67" o:spid="_x0000_s1026" style="position:absolute;z-index:251659264;visibility:visible;mso-wrap-style:square;mso-wrap-distance-left:9pt;mso-wrap-distance-top:0;mso-wrap-distance-right:9pt;mso-wrap-distance-bottom:0;mso-position-horizontal:absolute;mso-position-horizontal-relative:text;mso-position-vertical:absolute;mso-position-vertical-relative:text" from="53.15pt,17.5pt" to="225.15pt,17.5pt" o:gfxdata="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"/>
                   </w:pict>
@@ -457,7 +457,7 @@
               </wp:anchor>
             </w:drawing>
           </mc:Choice>
-          <mc:Fallback xmlns:w16cei="http://schemas.microsoft.com/office/word/2026/wordml/cei" xmlns:w16sdtfl="http://schemas.microsoft.com/office/word/2024/wordml/sdtformatlock" xmlns:wpsCustomData="http://www.wps.cn/officeDocument/2013/wpsCustomData">
+          <mc:Fallback xmlns:wpsCustomData="http://www.wps.cn/officeDocument/2013/wpsCustomData" xmlns:w16sdtfl="http://schemas.microsoft.com/office/word/2024/wordml/sdtformatlock" xmlns:w16cei="http://schemas.microsoft.com/office/word/2026/wordml/cei">
             <w:pict>
               <v:line id="Line 69" o:spid="_x0000_s1026" o:spt="20" style="position:absolute;left:0pt;margin-left:191pt;margin-top:4.95pt;height:0pt;width:68.25pt;z-index:251661312;mso-width-relative:page;mso-height-relative:page;" filled="f" stroked="t" coordsize="21600,21600" o:gfxdata="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">
                 <v:fill on="f" focussize="0,0"/>
@@ -1793,12 +1793,6 @@
         <w:jc w:val="both"/>
       </w:pPr>
       <w:r>
-        <w:rPr>
-          <w:b/>
-          <w:bCs/>
-          <w:i/>
-          <w:iCs/>
-        </w:rPr>
         <w:t>Nhà trường tổ chức Hội thảo khoa học chuyên đề “Chuyển đổi số toàn diện trong quản trị nhà trường gắn với nâng cao chất lượng đào tạo” (hoàn thành trước ngày 11/10/2026); tổ chức Hội thảo khoa học liên quan đến lĩnh vực trí tuệ nhân tạo, điện toán đám mây, công nghệ chuỗi khối và Hội nghị, Hội thảo khoa học chuyên đề cấp Trường về học sinh, sinh viên tham gia nghiên cứu khoa học, khởi nghiệp đổi mới sáng tạo; ban hành tạm thời khung kiến trúc dữ liệu, khung quản trị dữ liệu, từ điển dữ liệu và danh mục cơ sở dữ liệu dùng chung của Nhà trường (hoàn thành trước ngày 30/10/2026); triển khai Kế hoạch số 321/KH-UBND ngày 26/8/2026 của Chủ tịch UBND tỉnh về Chiến lược dữ liệu quốc gia giai đoạn 2026 - 2030, tầm nhìn đến năm 2045 trên địa bàn tỉnh Quảng Ngãi; ban hành văn bản hướng dẫn sử dụng trí tuệ nhân tạo để kiểm tra, rà soát các dự thảo đề cương, dự toán kinh phí đề tài khoa học và công nghệ; thẩm định hồ sơ đề nghị ban hành Skill sử dụng trên hệ thống Claude AI Team; triển khai công tác bảo vệ an ninh mạng theo Nghị định số 331/2026/NĐ-CP; tiếp tục thực hiện các đề tài khoa học và công nghệ cấp cơ sở năm 2026; tổ chức sinh hoạt khoa học chuyên đề cấp khoa, bộ môn và Hội thi thiết bị đào tạo tự làm cấp cơ sở lần thứ IV năm 2026; nhà giáo tham gia tập huấn ứng dụng AI, xây dựng học liệu số, bài giảng điện tử và khai thác hệ thống LMS.</w:t>
       </w:r>
     </w:p>
@@ -4145,10 +4139,6 @@
 </file>
 
 <file path=customXml/item1.xml><?xml version="1.0" encoding="utf-8"?>
-<b:Sources xmlns:b="http://schemas.openxmlformats.org/officeDocument/2006/bibliography" xmlns="http://schemas.openxmlformats.org/officeDocument/2006/bibliography" SelectedStyle="\APASixthEditionOfficeOnline.xsl" StyleName="APA" Version="6"/>
-</file>
-
-<file path=customXml/item2.xml><?xml version="1.0" encoding="utf-8"?>
 <s:customData xmlns="http://www.wps.cn/officeDocument/2013/wpsCustomData" xmlns:s="http://www.wps.cn/officeDocument/2013/wpsCustomData">
   <customSectProps/>
   <customShpExts>
@@ -4157,18 +4147,22 @@
 </s:customData>
 </file>
 
+<file path=customXml/item2.xml><?xml version="1.0" encoding="utf-8"?>
+<b:Sources xmlns:b="http://schemas.openxmlformats.org/officeDocument/2006/bibliography" xmlns="http://schemas.openxmlformats.org/officeDocument/2006/bibliography" SelectedStyle="\APASixthEditionOfficeOnline.xsl" StyleName="APA" Version="6"/>
+</file>
+
 <file path=customXml/itemProps1.xml><?xml version="1.0" encoding="utf-8"?>
+<ds:datastoreItem xmlns:ds="http://schemas.openxmlformats.org/officeDocument/2006/customXml" ds:itemID="{B1977F7D-205B-4081-913C-38D41E755F92}">
+  <ds:schemaRefs>
+    <ds:schemaRef ds:uri="http://www.wps.cn/officeDocument/2013/wpsCustomData"/>
+  </ds:schemaRefs>
+</ds:datastoreItem>
+</file>
+
+<file path=customXml/itemProps2.xml><?xml version="1.0" encoding="utf-8"?>
 <ds:datastoreItem xmlns:ds="http://schemas.openxmlformats.org/officeDocument/2006/customXml" ds:itemID="{990743A8-525E-4177-A851-F45E22B4A2D0}">
   <ds:schemaRefs>
     <ds:schemaRef ds:uri="http://schemas.openxmlformats.org/officeDocument/2006/bibliography"/>
   </ds:schemaRefs>
 </ds:datastoreItem>
-</file>
-
-<file path=customXml/itemProps2.xml><?xml version="1.0" encoding="utf-8"?>
-<ds:datastoreItem xmlns:ds="http://schemas.openxmlformats.org/officeDocument/2006/customXml" ds:itemID="{B1977F7D-205B-4081-913C-38D41E755F92}">
-  <ds:schemaRefs>
-    <ds:schemaRef ds:uri="http://www.wps.cn/officeDocument/2013/wpsCustomData"/>
-  </ds:schemaRefs>
-</ds:datastoreItem>
 </file>
</xml_diff>